<commit_message>
docs: add Zhou report and expand project presentation to fifteen slides
</commit_message>
<xml_diff>
--- a/docs/deliverables/下午班-08组-WEMOVE-SPORTS-分工与工作量报告-v1.2.docx
+++ b/docs/deliverables/下午班-08组-WEMOVE-SPORTS-分工与工作量报告-v1.2.docx
@@ -1380,7 +1380,7 @@
               <w:rPr>
                 <w:sz w:val="20"/>
               </w:rPr>
-              <w:t>项目汇报 PPT、测试报告及个人报告已整理；测试账号和 MFA 说明写入手册</w:t>
+              <w:t>项目汇报 PPT、测试报告及五份独立个人报告已整理；测试账号和 MFA 说明写入手册</w:t>
             </w:r>
           </w:p>
         </w:tc>
@@ -1403,7 +1403,21 @@
               <w:rPr>
                 <w:sz w:val="20"/>
               </w:rPr>
-              <w:t>deliverables 项目汇报 v1.2；operation-manual.md §1</w:t>
+              <w:t>deliverables 项目汇报 v1.3；</w:t>
+            </w:r>
+            <w:hyperlink r:id="rId10">
+              <w:r>
+                <w:rPr>
+                  <w:color w:val="245578"/>
+                </w:rPr>
+                <w:t>五份独立报告</w:t>
+              </w:r>
+            </w:hyperlink>
+            <w:r>
+              <w:rPr>
+                <w:sz w:val="20"/>
+              </w:rPr>
+              <w:t>；operation-manual.md §1</w:t>
             </w:r>
           </w:p>
         </w:tc>
@@ -1428,7 +1442,7 @@
       <w:r>
         <w:t xml:space="preserve"> 与 </w:t>
       </w:r>
-      <w:hyperlink r:id="rId10">
+      <w:hyperlink r:id="rId11">
         <w:r>
           <w:rPr>
             <w:color w:val="245578"/>

</xml_diff>

<commit_message>
docs: add student ID and confirm course workload allocation
</commit_message>
<xml_diff>
--- a/docs/deliverables/下午班-08组-WEMOVE-SPORTS-分工与工作量报告-v1.2.docx
+++ b/docs/deliverables/下午班-08组-WEMOVE-SPORTS-分工与工作量报告-v1.2.docx
@@ -12,7 +12,7 @@
     </w:p>
     <w:p>
       <w:r>
-        <w:t>更新日期：2026-09-08。负责人：甘文韬。</w:t>
+        <w:t>更新日期：2026-09-08。负责人：甘文韬（学号：24150728）。</w:t>
       </w:r>
     </w:p>
     <w:p>
@@ -158,7 +158,7 @@
                 <w:b/>
                 <w:sz w:val="19"/>
               </w:rPr>
-              <w:t>计划工作量</w:t>
+              <w:t>工作量占比</w:t>
             </w:r>
           </w:p>
         </w:tc>
@@ -768,7 +768,7 @@
     </w:p>
     <w:p>
       <w:r>
-        <w:t>计划工作量调整为甘文韬 25%，其余四人平分剩余 75%，各占 18.75%，合计 100%。各成员任务归属保持不变。这是任务承接后的计划工作量；结项统计须依据实际代码、文档、评审、测试与演示证据确认，不当作已完成贡献。</w:t>
+        <w:t>本表采用组长确认的工作量占比：甘文韬 25%，陈婧琳、周慧莹、倪依玲、龙祖怡各 18.75%，合计 100%。课程提交统一采用此比例，各成员职责及历史作者记录保持原有归属。</w:t>
       </w:r>
     </w:p>
     <w:p>
@@ -1459,12 +1459,12 @@
         <w:pStyle w:val="Heading1"/>
       </w:pPr>
       <w:r>
-        <w:t>结项统计方式</w:t>
+        <w:t>课程提交口径</w:t>
       </w:r>
     </w:p>
     <w:p>
       <w:r>
-        <w:t>建议仍按开发联调 60%、文档 25%、协作演示 15% 归集证据。结项时逐人列出已完成任务及证据，另填写实际贡献比例和确认日期；确认前使用本表的计划比例安排工作。</w:t>
+        <w:t>课程材料、PPT 和提交包中的成员工作量均使用本表比例，不按实际工时重新折算。代码、文档、评审和测试记录用于说明已完成任务与职责，不用于另行调整已确认占比。</w:t>
       </w:r>
     </w:p>
     <w:sectPr>

</xml_diff>